<commit_message>
docs: completar URL real del repositorio en portada y README
Sustituye el marcador PENDIENTE por la URL real del remoto ya
configurado (github.com/maryorifajardo14/proyecto-hospitalario_personal);
el commit/etiqueta evaluada queda pendiente hasta despues del push.
</commit_message>
<xml_diff>
--- a/docs/Documento_Final_Fajardo_Maryori.docx
+++ b/docs/Documento_Final_Fajardo_Maryori.docx
@@ -241,10 +241,7 @@
               <w:pStyle w:val="Compact"/>
             </w:pPr>
             <w:r>
-              <w:rPr>
-                <w:rStyle w:val="VerbatimChar"/>
-              </w:rPr>
-              <w:t xml:space="preserve">PENDIENTE: completar con la URL del remoto en GitHub tras el push</w:t>
+              <w:t xml:space="preserve">https://github.com/maryorifajardo14/proyecto-hospitalario_personal</w:t>
             </w:r>
           </w:p>
         </w:tc>
@@ -298,7 +295,7 @@
               <w:rPr>
                 <w:rStyle w:val="VerbatimChar"/>
               </w:rPr>
-              <w:t xml:space="preserve">PENDIENTE: completar con el hash del commit final (ver docs/EVIDENCIA_GIT.md)</w:t>
+              <w:t xml:space="preserve">PENDIENTE: completar con el hash del commit final tras el push (ver docs/EVIDENCIA_GIT.md)</w:t>
             </w:r>
           </w:p>
         </w:tc>

</xml_diff>